<commit_message>
chore: add required DOCX templates (plagas/piscinas/camaras)
</commit_message>
<xml_diff>
--- a/templates/templatescotizacion_camaras.docx
+++ b/templates/templatescotizacion_camaras.docx
@@ -10,24 +10,556 @@
           <w:sz w:val="52"/>
         </w:rPr>
       </w:pPr>
-      <w:r>
-        <w:rPr>
+    </w:p>
+    <w:p>
+      <w:pPr>
+        <w:pStyle w:val="Textoindependiente"/>
+        <w:spacing w:before="161"/>
+        <w:rPr>
+          <w:rFonts w:ascii="Times New Roman"/>
+          <w:sz w:val="52"/>
+        </w:rPr>
+      </w:pPr>
+    </w:p>
+    <w:p>
+      <w:pPr>
+        <w:ind w:left="2975"/>
+        <w:rPr>
+          <w:b/>
+          <w:sz w:val="52"/>
+        </w:rPr>
+      </w:pPr>
+    </w:p>
+    <w:p>
+      <w:pPr>
+        <w:pStyle w:val="Textoindependiente"/>
+        <w:spacing w:before="4"/>
+        <w:rPr>
+          <w:b/>
+          <w:sz w:val="92"/>
+        </w:rPr>
+      </w:pPr>
+    </w:p>
+    <w:p>
+      <w:pPr>
+        <w:pStyle w:val="Ttulo"/>
+        <w:rPr>
+          <w:rFonts w:ascii="DejaVu Sans" w:hAnsi="DejaVu Sans" w:cs="DejaVu Sans"/>
+          <w:sz w:val="72"/>
+          <w:szCs w:val="72"/>
+        </w:rPr>
+      </w:pPr>
+      <w:r>
+        <w:rPr>
+          <w:rFonts w:ascii="DejaVu Sans" w:hAnsi="DejaVu Sans" w:cs="DejaVu Sans"/>
+          <w:color w:val="3762B8"/>
+          <w:spacing w:val="-14"/>
+          <w:sz w:val="72"/>
+          <w:szCs w:val="72"/>
+        </w:rPr>
+        <w:t>Cotización</w:t>
+      </w:r>
+      <w:r>
+        <w:rPr>
+          <w:rFonts w:ascii="DejaVu Sans" w:hAnsi="DejaVu Sans" w:cs="DejaVu Sans"/>
+          <w:color w:val="3762B8"/>
+          <w:spacing w:val="-88"/>
+          <w:sz w:val="72"/>
+          <w:szCs w:val="72"/>
+        </w:rPr>
+        <w:t xml:space="preserve"> </w:t>
+      </w:r>
+      <w:r>
+        <w:rPr>
+          <w:rFonts w:ascii="DejaVu Sans" w:hAnsi="DejaVu Sans" w:cs="DejaVu Sans"/>
+          <w:color w:val="3762B8"/>
+          <w:spacing w:val="-14"/>
+          <w:sz w:val="72"/>
+          <w:szCs w:val="72"/>
+        </w:rPr>
+        <w:t>de</w:t>
+      </w:r>
+      <w:r>
+        <w:rPr>
+          <w:rFonts w:ascii="DejaVu Sans" w:hAnsi="DejaVu Sans" w:cs="DejaVu Sans"/>
+          <w:color w:val="3762B8"/>
+          <w:spacing w:val="-88"/>
+          <w:sz w:val="72"/>
+          <w:szCs w:val="72"/>
+        </w:rPr>
+        <w:t xml:space="preserve"> </w:t>
+      </w:r>
+      <w:r>
+        <w:rPr>
+          <w:rFonts w:ascii="DejaVu Sans" w:hAnsi="DejaVu Sans" w:cs="DejaVu Sans"/>
+          <w:color w:val="3762B8"/>
+          <w:spacing w:val="-14"/>
+          <w:sz w:val="72"/>
+          <w:szCs w:val="72"/>
+        </w:rPr>
+        <w:t>Servicios</w:t>
+      </w:r>
+    </w:p>
+    <w:p>
+      <w:pPr>
+        <w:pStyle w:val="Textoindependiente"/>
+        <w:spacing w:before="10"/>
+        <w:rPr>
+          <w:b/>
+          <w:sz w:val="19"/>
+        </w:rPr>
+      </w:pPr>
+    </w:p>
+    <w:p>
+      <w:pPr>
+        <w:pStyle w:val="Textoindependiente"/>
+        <w:rPr>
+          <w:b/>
+          <w:sz w:val="19"/>
+        </w:rPr>
+        <w:sectPr>
+          <w:type w:val="continuous"/>
+          <w:pgSz w:w="16850" w:h="23810"/>
+          <w:pgMar w:top="0" w:right="1275" w:bottom="0" w:left="1133" w:header="720" w:footer="720" w:gutter="0"/>
+          <w:cols w:space="720"/>
+        </w:sectPr>
+      </w:pPr>
+    </w:p>
+    <w:p>
+      <w:pPr>
+        <w:pStyle w:val="Ttulo1"/>
+        <w:ind w:left="550"/>
+      </w:pPr>
+      <w:r>
+        <w:rPr>
+          <w:color w:val="1F2A5B"/>
+          <w:spacing w:val="-10"/>
+        </w:rPr>
+        <w:t>Datos</w:t>
+      </w:r>
+      <w:r>
+        <w:rPr>
+          <w:color w:val="1F2A5B"/>
+          <w:spacing w:val="-34"/>
+        </w:rPr>
+        <w:t xml:space="preserve"> </w:t>
+      </w:r>
+      <w:r>
+        <w:rPr>
+          <w:color w:val="1F2A5B"/>
+          <w:spacing w:val="-10"/>
+        </w:rPr>
+        <w:t>del</w:t>
+      </w:r>
+      <w:r>
+        <w:rPr>
+          <w:color w:val="1F2A5B"/>
+          <w:spacing w:val="-34"/>
+        </w:rPr>
+        <w:t xml:space="preserve"> </w:t>
+      </w:r>
+      <w:r>
+        <w:rPr>
+          <w:color w:val="1F2A5B"/>
+          <w:spacing w:val="-10"/>
+        </w:rPr>
+        <w:t>Cliente</w:t>
+      </w:r>
+    </w:p>
+    <w:p>
+      <w:pPr>
+        <w:pStyle w:val="Ttulo2"/>
+        <w:ind w:left="550"/>
+        <w:rPr>
+          <w:rFonts w:ascii="DejaVu Sans" w:hAnsi="DejaVu Sans" w:cs="DejaVu Sans"/>
+        </w:rPr>
+      </w:pPr>
+      <w:r>
+        <w:t>{{</w:t>
+      </w:r>
+      <w:r>
+        <w:rPr>
+          <w:rFonts w:ascii="DejaVu Sans" w:hAnsi="DejaVu Sans" w:cs="DejaVu Sans"/>
+        </w:rPr>
+        <w:t>cliente}}</w:t>
+      </w:r>
+    </w:p>
+    <w:p>
+      <w:pPr>
+        <w:spacing w:before="99"/>
+        <w:ind w:left="550"/>
+        <w:rPr>
+          <w:rFonts w:ascii="DejaVu Sans" w:hAnsi="DejaVu Sans" w:cs="DejaVu Sans"/>
+          <w:sz w:val="32"/>
+        </w:rPr>
+      </w:pPr>
+      <w:r>
+        <w:rPr>
+          <w:rFonts w:ascii="DejaVu Sans" w:hAnsi="DejaVu Sans" w:cs="DejaVu Sans"/>
+          <w:sz w:val="32"/>
+        </w:rPr>
+        <w:t>{{</w:t>
+      </w:r>
+      <w:proofErr w:type="spellStart"/>
+      <w:r>
+        <w:rPr>
+          <w:rFonts w:ascii="DejaVu Sans" w:hAnsi="DejaVu Sans" w:cs="DejaVu Sans"/>
+          <w:sz w:val="32"/>
+        </w:rPr>
+        <w:t>direccion</w:t>
+      </w:r>
+      <w:proofErr w:type="spellEnd"/>
+      <w:r>
+        <w:rPr>
+          <w:rFonts w:ascii="DejaVu Sans" w:hAnsi="DejaVu Sans" w:cs="DejaVu Sans"/>
+          <w:sz w:val="32"/>
+        </w:rPr>
+        <w:t>}}</w:t>
+      </w:r>
+    </w:p>
+    <w:p>
+      <w:pPr>
+        <w:spacing w:before="100"/>
+        <w:ind w:left="550"/>
+        <w:rPr>
+          <w:rFonts w:ascii="DejaVu Sans" w:hAnsi="DejaVu Sans" w:cs="DejaVu Sans"/>
+          <w:sz w:val="32"/>
+        </w:rPr>
+      </w:pPr>
+      <w:r>
+        <w:rPr>
+          <w:rFonts w:ascii="DejaVu Sans" w:hAnsi="DejaVu Sans" w:cs="DejaVu Sans"/>
+          <w:sz w:val="32"/>
+        </w:rPr>
+        <w:t>{{comuna}}</w:t>
+      </w:r>
+    </w:p>
+    <w:p>
+      <w:pPr>
+        <w:spacing w:before="100"/>
+        <w:ind w:left="550"/>
+        <w:rPr>
+          <w:rFonts w:ascii="DejaVu Sans" w:hAnsi="DejaVu Sans" w:cs="DejaVu Sans"/>
+          <w:sz w:val="32"/>
+        </w:rPr>
+      </w:pPr>
+      <w:r>
+        <w:rPr>
+          <w:rFonts w:ascii="DejaVu Sans" w:hAnsi="DejaVu Sans" w:cs="DejaVu Sans"/>
+          <w:sz w:val="32"/>
+        </w:rPr>
+        <w:t>{{contacto}}</w:t>
+      </w:r>
+    </w:p>
+    <w:p>
+      <w:pPr>
+        <w:spacing w:before="100"/>
+        <w:ind w:left="550"/>
+        <w:rPr>
+          <w:rFonts w:ascii="DejaVu Sans" w:hAnsi="DejaVu Sans" w:cs="DejaVu Sans"/>
+          <w:sz w:val="32"/>
+        </w:rPr>
+      </w:pPr>
+      <w:r>
+        <w:rPr>
+          <w:rFonts w:ascii="DejaVu Sans" w:hAnsi="DejaVu Sans" w:cs="DejaVu Sans"/>
+          <w:sz w:val="32"/>
+        </w:rPr>
+        <w:t>{{email}}</w:t>
+      </w:r>
+    </w:p>
+    <w:p>
+      <w:pPr>
+        <w:pStyle w:val="Textoindependiente"/>
+        <w:rPr>
+          <w:rFonts w:ascii="DejaVu Sans" w:hAnsi="DejaVu Sans" w:cs="DejaVu Sans"/>
+          <w:sz w:val="32"/>
+        </w:rPr>
+      </w:pPr>
+    </w:p>
+    <w:p>
+      <w:pPr>
+        <w:pStyle w:val="Textoindependiente"/>
+        <w:spacing w:before="66"/>
+        <w:rPr>
+          <w:rFonts w:ascii="DejaVu Sans" w:hAnsi="DejaVu Sans" w:cs="DejaVu Sans"/>
+          <w:sz w:val="32"/>
+        </w:rPr>
+      </w:pPr>
+    </w:p>
+    <w:p>
+      <w:pPr>
+        <w:pStyle w:val="Ttulo1"/>
+        <w:spacing w:before="1"/>
+        <w:rPr>
+          <w:rFonts w:ascii="DejaVu Sans" w:hAnsi="DejaVu Sans" w:cs="DejaVu Sans"/>
+        </w:rPr>
+      </w:pPr>
+      <w:r>
+        <w:rPr>
+          <w:rFonts w:ascii="DejaVu Sans" w:hAnsi="DejaVu Sans" w:cs="DejaVu Sans"/>
+          <w:color w:val="1F2A5B"/>
+          <w:spacing w:val="-4"/>
+        </w:rPr>
+        <w:t>DESCRIPCIÓN:</w:t>
+      </w:r>
+    </w:p>
+    <w:p>
+      <w:pPr>
+        <w:spacing w:before="89"/>
+        <w:ind w:left="400"/>
+        <w:rPr>
+          <w:rFonts w:ascii="DejaVu Sans" w:hAnsi="DejaVu Sans" w:cs="DejaVu Sans"/>
+          <w:b/>
+          <w:sz w:val="36"/>
+        </w:rPr>
+      </w:pPr>
+      <w:r>
+        <w:rPr>
+          <w:rFonts w:ascii="DejaVu Sans" w:hAnsi="DejaVu Sans" w:cs="DejaVu Sans"/>
+        </w:rPr>
+        <w:br w:type="column"/>
+      </w:r>
+      <w:r>
+        <w:rPr>
+          <w:rFonts w:ascii="DejaVu Sans" w:hAnsi="DejaVu Sans" w:cs="DejaVu Sans"/>
+          <w:b/>
+          <w:color w:val="1F2A5B"/>
+          <w:spacing w:val="-10"/>
+          <w:sz w:val="36"/>
+        </w:rPr>
+        <w:t>Datos</w:t>
+      </w:r>
+      <w:r>
+        <w:rPr>
+          <w:rFonts w:ascii="DejaVu Sans" w:hAnsi="DejaVu Sans" w:cs="DejaVu Sans"/>
+          <w:b/>
+          <w:color w:val="1F2A5B"/>
+          <w:spacing w:val="-34"/>
+          <w:sz w:val="36"/>
+        </w:rPr>
+        <w:t xml:space="preserve"> </w:t>
+      </w:r>
+      <w:r>
+        <w:rPr>
+          <w:rFonts w:ascii="DejaVu Sans" w:hAnsi="DejaVu Sans" w:cs="DejaVu Sans"/>
+          <w:b/>
+          <w:color w:val="1F2A5B"/>
+          <w:spacing w:val="-10"/>
+          <w:sz w:val="36"/>
+        </w:rPr>
+        <w:t>del</w:t>
+      </w:r>
+      <w:r>
+        <w:rPr>
+          <w:rFonts w:ascii="DejaVu Sans" w:hAnsi="DejaVu Sans" w:cs="DejaVu Sans"/>
+          <w:b/>
+          <w:color w:val="1F2A5B"/>
+          <w:spacing w:val="-34"/>
+          <w:sz w:val="36"/>
+        </w:rPr>
+        <w:t xml:space="preserve"> </w:t>
+      </w:r>
+      <w:r>
+        <w:rPr>
+          <w:rFonts w:ascii="DejaVu Sans" w:hAnsi="DejaVu Sans" w:cs="DejaVu Sans"/>
+          <w:b/>
+          <w:color w:val="1F2A5B"/>
+          <w:spacing w:val="-10"/>
+          <w:sz w:val="36"/>
+        </w:rPr>
+        <w:t>Emisor</w:t>
+      </w:r>
+    </w:p>
+    <w:p>
+      <w:pPr>
+        <w:pStyle w:val="Ttulo2"/>
+        <w:ind w:left="400"/>
+        <w:rPr>
+          <w:rFonts w:ascii="DejaVu Sans" w:hAnsi="DejaVu Sans" w:cs="DejaVu Sans"/>
+        </w:rPr>
+      </w:pPr>
+      <w:r>
+        <w:rPr>
+          <w:rFonts w:ascii="DejaVu Sans" w:hAnsi="DejaVu Sans" w:cs="DejaVu Sans"/>
+        </w:rPr>
+        <w:t>SMART</w:t>
+      </w:r>
+      <w:r>
+        <w:rPr>
+          <w:rFonts w:ascii="DejaVu Sans" w:hAnsi="DejaVu Sans" w:cs="DejaVu Sans"/>
+          <w:spacing w:val="33"/>
+        </w:rPr>
+        <w:t xml:space="preserve"> </w:t>
+      </w:r>
+      <w:r>
+        <w:rPr>
+          <w:rFonts w:ascii="DejaVu Sans" w:hAnsi="DejaVu Sans" w:cs="DejaVu Sans"/>
+        </w:rPr>
+        <w:t>PLAGAS</w:t>
+      </w:r>
+      <w:r>
+        <w:rPr>
+          <w:rFonts w:ascii="DejaVu Sans" w:hAnsi="DejaVu Sans" w:cs="DejaVu Sans"/>
+          <w:spacing w:val="34"/>
+        </w:rPr>
+        <w:t xml:space="preserve"> </w:t>
+      </w:r>
+      <w:r>
+        <w:rPr>
+          <w:rFonts w:ascii="DejaVu Sans" w:hAnsi="DejaVu Sans" w:cs="DejaVu Sans"/>
+          <w:spacing w:val="-2"/>
+        </w:rPr>
+        <w:t>E.I.R.L.</w:t>
+      </w:r>
+    </w:p>
+    <w:p>
+      <w:pPr>
+        <w:spacing w:before="99"/>
+        <w:ind w:left="400"/>
+        <w:rPr>
+          <w:rFonts w:ascii="DejaVu Sans" w:hAnsi="DejaVu Sans" w:cs="DejaVu Sans"/>
+          <w:sz w:val="32"/>
+        </w:rPr>
+      </w:pPr>
+      <w:r>
+        <w:rPr>
+          <w:rFonts w:ascii="DejaVu Sans" w:hAnsi="DejaVu Sans" w:cs="DejaVu Sans"/>
+          <w:sz w:val="32"/>
+        </w:rPr>
+        <w:t>+56</w:t>
+      </w:r>
+      <w:r>
+        <w:rPr>
+          <w:rFonts w:ascii="DejaVu Sans" w:hAnsi="DejaVu Sans" w:cs="DejaVu Sans"/>
+          <w:spacing w:val="-25"/>
+          <w:sz w:val="32"/>
+        </w:rPr>
+        <w:t xml:space="preserve"> </w:t>
+      </w:r>
+      <w:r>
+        <w:rPr>
+          <w:rFonts w:ascii="DejaVu Sans" w:hAnsi="DejaVu Sans" w:cs="DejaVu Sans"/>
+          <w:sz w:val="32"/>
+        </w:rPr>
+        <w:t>9</w:t>
+      </w:r>
+      <w:r>
+        <w:rPr>
+          <w:rFonts w:ascii="DejaVu Sans" w:hAnsi="DejaVu Sans" w:cs="DejaVu Sans"/>
+          <w:spacing w:val="-25"/>
+          <w:sz w:val="32"/>
+        </w:rPr>
+        <w:t xml:space="preserve"> </w:t>
+      </w:r>
+      <w:r>
+        <w:rPr>
+          <w:rFonts w:ascii="DejaVu Sans" w:hAnsi="DejaVu Sans" w:cs="DejaVu Sans"/>
+          <w:sz w:val="32"/>
+        </w:rPr>
+        <w:t>5816</w:t>
+      </w:r>
+      <w:r>
+        <w:rPr>
+          <w:rFonts w:ascii="DejaVu Sans" w:hAnsi="DejaVu Sans" w:cs="DejaVu Sans"/>
+          <w:spacing w:val="-24"/>
+          <w:sz w:val="32"/>
+        </w:rPr>
+        <w:t xml:space="preserve"> </w:t>
+      </w:r>
+      <w:r>
+        <w:rPr>
+          <w:rFonts w:ascii="DejaVu Sans" w:hAnsi="DejaVu Sans" w:cs="DejaVu Sans"/>
+          <w:spacing w:val="-4"/>
+          <w:sz w:val="32"/>
+        </w:rPr>
+        <w:t>6055</w:t>
+      </w:r>
+    </w:p>
+    <w:p>
+      <w:pPr>
+        <w:spacing w:before="100" w:line="302" w:lineRule="auto"/>
+        <w:ind w:left="400" w:right="2619"/>
+        <w:rPr>
+          <w:rFonts w:ascii="DejaVu Sans" w:hAnsi="DejaVu Sans" w:cs="DejaVu Sans"/>
+          <w:sz w:val="32"/>
+        </w:rPr>
+      </w:pPr>
+      <w:hyperlink r:id="rId5">
+        <w:r>
+          <w:rPr>
+            <w:rFonts w:ascii="DejaVu Sans" w:hAnsi="DejaVu Sans" w:cs="DejaVu Sans"/>
+            <w:spacing w:val="-2"/>
+            <w:sz w:val="32"/>
+          </w:rPr>
+          <w:t>contacto@smartplagas.cl</w:t>
+        </w:r>
+      </w:hyperlink>
+      <w:r>
+        <w:rPr>
+          <w:rFonts w:ascii="DejaVu Sans" w:hAnsi="DejaVu Sans" w:cs="DejaVu Sans"/>
+          <w:spacing w:val="-2"/>
+          <w:sz w:val="32"/>
+        </w:rPr>
+        <w:t xml:space="preserve"> </w:t>
+      </w:r>
+      <w:hyperlink r:id="rId6">
+        <w:r>
+          <w:rPr>
+            <w:rFonts w:ascii="DejaVu Sans" w:hAnsi="DejaVu Sans" w:cs="DejaVu Sans"/>
+            <w:spacing w:val="-2"/>
+            <w:sz w:val="32"/>
+          </w:rPr>
+          <w:t>www.smartplagas.cl</w:t>
+        </w:r>
+      </w:hyperlink>
+    </w:p>
+    <w:p>
+      <w:pPr>
+        <w:spacing w:line="302" w:lineRule="auto"/>
+        <w:rPr>
+          <w:rFonts w:ascii="DejaVu Sans" w:hAnsi="DejaVu Sans" w:cs="DejaVu Sans"/>
+          <w:sz w:val="32"/>
+        </w:rPr>
+        <w:sectPr>
+          <w:type w:val="continuous"/>
+          <w:pgSz w:w="16850" w:h="23810"/>
+          <w:pgMar w:top="0" w:right="1275" w:bottom="0" w:left="1133" w:header="720" w:footer="720" w:gutter="0"/>
+          <w:cols w:num="2" w:space="720" w:equalWidth="0">
+            <w:col w:w="5108" w:space="2688"/>
+            <w:col w:w="6646"/>
+          </w:cols>
+        </w:sectPr>
+      </w:pPr>
+    </w:p>
+    <w:p>
+      <w:pPr>
+        <w:spacing w:before="211" w:line="276" w:lineRule="auto"/>
+        <w:ind w:left="400"/>
+        <w:rPr>
+          <w:rFonts w:ascii="DejaVu Sans" w:hAnsi="DejaVu Sans" w:cs="DejaVu Sans"/>
+          <w:sz w:val="32"/>
+        </w:rPr>
+      </w:pPr>
+      <w:r>
+        <w:rPr>
+          <w:rFonts w:ascii="DejaVu Sans" w:hAnsi="DejaVu Sans" w:cs="DejaVu Sans"/>
           <w:noProof/>
           <w:sz w:val="32"/>
         </w:rPr>
         <mc:AlternateContent>
           <mc:Choice Requires="wpg">
             <w:drawing>
-              <wp:anchor distT="0" distB="0" distL="0" distR="0" simplePos="0" relativeHeight="487507456" behindDoc="1" locked="0" layoutInCell="1" allowOverlap="1" wp14:anchorId="3707BCF5" wp14:editId="7F60C884">
+              <wp:anchor distT="0" distB="0" distL="0" distR="0" simplePos="0" relativeHeight="487507456" behindDoc="1" locked="0" layoutInCell="1" allowOverlap="1" wp14:anchorId="3707BCF5" wp14:editId="3EE8E709">
                 <wp:simplePos x="0" y="0"/>
                 <wp:positionH relativeFrom="page">
-                  <wp:posOffset>603885</wp:posOffset>
+                  <wp:posOffset>509193</wp:posOffset>
                 </wp:positionH>
-                <wp:positionV relativeFrom="margin">
-                  <wp:align>top</wp:align>
+                <wp:positionV relativeFrom="page">
+                  <wp:posOffset>0</wp:posOffset>
                 </wp:positionV>
                 <wp:extent cx="10187940" cy="6147435"/>
-                <wp:effectExtent l="0" t="0" r="3810" b="0"/>
+                <wp:effectExtent l="0" t="0" r="0" b="0"/>
                 <wp:wrapNone/>
                 <wp:docPr id="1" name="Group 1"/>
                 <wp:cNvGraphicFramePr>
@@ -53,7 +585,7 @@
                           <pic:cNvPicPr/>
                         </pic:nvPicPr>
                         <pic:blipFill>
-                          <a:blip r:embed="rId5" cstate="print"/>
+                          <a:blip r:embed="rId7" cstate="print"/>
                           <a:stretch>
                             <a:fillRect/>
                           </a:stretch>
@@ -74,7 +606,7 @@
                           <pic:cNvPicPr/>
                         </pic:nvPicPr>
                         <pic:blipFill>
-                          <a:blip r:embed="rId6" cstate="print"/>
+                          <a:blip r:embed="rId8" cstate="print"/>
                           <a:stretch>
                             <a:fillRect/>
                           </a:stretch>
@@ -97,7 +629,7 @@
           </mc:Choice>
           <mc:Fallback>
             <w:pict>
-              <v:group w14:anchorId="1D27ADD3" id="Group 1" o:spid="_x0000_s1026" style="position:absolute;margin-left:47.55pt;margin-top:0;width:802.2pt;height:484.05pt;z-index:-15809024;mso-wrap-distance-left:0;mso-wrap-distance-right:0;mso-position-horizontal-relative:page;mso-position-vertical:top;mso-position-vertical-relative:margin" coordsize="101879,61474" o:gfxdata="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">
+              <v:group w14:anchorId="5105F775" id="Group 1" o:spid="_x0000_s1026" style="position:absolute;margin-left:40.1pt;margin-top:0;width:802.2pt;height:484.05pt;z-index:-15809024;mso-wrap-distance-left:0;mso-wrap-distance-right:0;mso-position-horizontal-relative:page;mso-position-vertical-relative:page" coordsize="101879,61474" o:gfxdata="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">
                 <v:shapetype id="_x0000_t75" coordsize="21600,21600" o:spt="75" o:preferrelative="t" path="m@4@5l@4@11@9@11@9@5xe" filled="f" stroked="f">
                   <v:stroke joinstyle="miter"/>
                   <v:formulas>
@@ -118,563 +650,22 @@
                   <o:lock v:ext="edit" aspectratio="t"/>
                 </v:shapetype>
                 <v:shape id="Image 2" o:spid="_x0000_s1027" type="#_x0000_t75" style="position:absolute;width:101873;height:61471;visibility:visible;mso-wrap-style:square" o:gfxdata="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">
-                  <v:imagedata r:id="rId7" o:title=""/>
+                  <v:imagedata r:id="rId9" o:title=""/>
                 </v:shape>
                 <v:shape id="Image 3" o:spid="_x0000_s1028" type="#_x0000_t75" style="position:absolute;left:5068;top:3364;width:14664;height:14665;visibility:visible;mso-wrap-style:square" o:gfxdata="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">
-                  <v:imagedata r:id="rId8" o:title=""/>
+                  <v:imagedata r:id="rId10" o:title=""/>
                 </v:shape>
-                <w10:wrap anchorx="page" anchory="margin"/>
+                <w10:wrap anchorx="page" anchory="page"/>
               </v:group>
             </w:pict>
           </mc:Fallback>
         </mc:AlternateContent>
       </w:r>
-    </w:p>
-    <w:p>
-      <w:pPr>
-        <w:pStyle w:val="Textoindependiente"/>
-        <w:spacing w:before="161"/>
-        <w:rPr>
-          <w:rFonts w:ascii="Times New Roman"/>
-          <w:sz w:val="52"/>
-        </w:rPr>
-      </w:pPr>
-    </w:p>
-    <w:p>
-      <w:pPr>
-        <w:ind w:left="2975"/>
-        <w:rPr>
-          <w:b/>
-          <w:sz w:val="52"/>
-        </w:rPr>
-      </w:pPr>
-    </w:p>
-    <w:p>
-      <w:pPr>
-        <w:pStyle w:val="Textoindependiente"/>
-        <w:spacing w:before="4"/>
-        <w:rPr>
-          <w:b/>
-          <w:sz w:val="92"/>
-        </w:rPr>
-      </w:pPr>
-    </w:p>
-    <w:p>
-      <w:pPr>
-        <w:pStyle w:val="Ttulo"/>
-        <w:rPr>
-          <w:rFonts w:ascii="DejaVu Sans" w:hAnsi="DejaVu Sans" w:cs="DejaVu Sans"/>
-          <w:sz w:val="72"/>
-          <w:szCs w:val="72"/>
-        </w:rPr>
-      </w:pPr>
-      <w:r>
-        <w:rPr>
-          <w:rFonts w:ascii="DejaVu Sans" w:hAnsi="DejaVu Sans" w:cs="DejaVu Sans"/>
-          <w:color w:val="3762B8"/>
-          <w:spacing w:val="-14"/>
-          <w:sz w:val="72"/>
-          <w:szCs w:val="72"/>
-        </w:rPr>
-        <w:t>Cotización</w:t>
-      </w:r>
-      <w:r>
-        <w:rPr>
-          <w:rFonts w:ascii="DejaVu Sans" w:hAnsi="DejaVu Sans" w:cs="DejaVu Sans"/>
-          <w:color w:val="3762B8"/>
-          <w:spacing w:val="-88"/>
-          <w:sz w:val="72"/>
-          <w:szCs w:val="72"/>
-        </w:rPr>
-        <w:t xml:space="preserve"> </w:t>
-      </w:r>
-      <w:r>
-        <w:rPr>
-          <w:rFonts w:ascii="DejaVu Sans" w:hAnsi="DejaVu Sans" w:cs="DejaVu Sans"/>
-          <w:color w:val="3762B8"/>
-          <w:spacing w:val="-14"/>
-          <w:sz w:val="72"/>
-          <w:szCs w:val="72"/>
-        </w:rPr>
-        <w:t>de</w:t>
-      </w:r>
-      <w:r>
-        <w:rPr>
-          <w:rFonts w:ascii="DejaVu Sans" w:hAnsi="DejaVu Sans" w:cs="DejaVu Sans"/>
-          <w:color w:val="3762B8"/>
-          <w:spacing w:val="-88"/>
-          <w:sz w:val="72"/>
-          <w:szCs w:val="72"/>
-        </w:rPr>
-        <w:t xml:space="preserve"> </w:t>
-      </w:r>
-      <w:r>
-        <w:rPr>
-          <w:rFonts w:ascii="DejaVu Sans" w:hAnsi="DejaVu Sans" w:cs="DejaVu Sans"/>
-          <w:color w:val="3762B8"/>
-          <w:spacing w:val="-14"/>
-          <w:sz w:val="72"/>
-          <w:szCs w:val="72"/>
-        </w:rPr>
-        <w:t>Servicios</w:t>
-      </w:r>
-    </w:p>
-    <w:p>
-      <w:pPr>
-        <w:pStyle w:val="Textoindependiente"/>
-        <w:spacing w:before="10"/>
-        <w:rPr>
-          <w:b/>
-          <w:sz w:val="19"/>
-        </w:rPr>
-      </w:pPr>
-    </w:p>
-    <w:p>
-      <w:pPr>
-        <w:pStyle w:val="Textoindependiente"/>
-        <w:rPr>
-          <w:b/>
-          <w:sz w:val="19"/>
-        </w:rPr>
-        <w:sectPr>
-          <w:type w:val="continuous"/>
-          <w:pgSz w:w="16850" w:h="23810"/>
-          <w:pgMar w:top="0" w:right="1275" w:bottom="0" w:left="1133" w:header="720" w:footer="720" w:gutter="0"/>
-          <w:cols w:space="720"/>
-        </w:sectPr>
-      </w:pPr>
-    </w:p>
-    <w:p>
-      <w:pPr>
-        <w:pStyle w:val="Ttulo1"/>
-        <w:ind w:left="550"/>
-        <w:rPr>
-          <w:rFonts w:ascii="DejaVu Sans" w:hAnsi="DejaVu Sans" w:cs="DejaVu Sans"/>
-        </w:rPr>
-      </w:pPr>
-      <w:r>
-        <w:rPr>
-          <w:rFonts w:ascii="DejaVu Sans" w:hAnsi="DejaVu Sans" w:cs="DejaVu Sans"/>
-          <w:color w:val="1F2A5B"/>
-          <w:spacing w:val="-10"/>
-        </w:rPr>
-        <w:t>Datos</w:t>
-      </w:r>
-      <w:r>
-        <w:rPr>
-          <w:rFonts w:ascii="DejaVu Sans" w:hAnsi="DejaVu Sans" w:cs="DejaVu Sans"/>
-          <w:color w:val="1F2A5B"/>
-          <w:spacing w:val="-34"/>
-        </w:rPr>
-        <w:t xml:space="preserve"> </w:t>
-      </w:r>
-      <w:r>
-        <w:rPr>
-          <w:rFonts w:ascii="DejaVu Sans" w:hAnsi="DejaVu Sans" w:cs="DejaVu Sans"/>
-          <w:color w:val="1F2A5B"/>
-          <w:spacing w:val="-10"/>
-        </w:rPr>
-        <w:t>del</w:t>
-      </w:r>
-      <w:r>
-        <w:rPr>
-          <w:rFonts w:ascii="DejaVu Sans" w:hAnsi="DejaVu Sans" w:cs="DejaVu Sans"/>
-          <w:color w:val="1F2A5B"/>
-          <w:spacing w:val="-34"/>
-        </w:rPr>
-        <w:t xml:space="preserve"> </w:t>
-      </w:r>
-      <w:r>
-        <w:rPr>
-          <w:rFonts w:ascii="DejaVu Sans" w:hAnsi="DejaVu Sans" w:cs="DejaVu Sans"/>
-          <w:color w:val="1F2A5B"/>
-          <w:spacing w:val="-10"/>
-        </w:rPr>
-        <w:t>Cliente</w:t>
-      </w:r>
-    </w:p>
-    <w:p>
-      <w:pPr>
-        <w:pStyle w:val="Ttulo2"/>
-        <w:ind w:left="550"/>
-        <w:rPr>
-          <w:rFonts w:ascii="DejaVu Sans" w:hAnsi="DejaVu Sans" w:cs="DejaVu Sans"/>
-        </w:rPr>
-      </w:pPr>
-      <w:r>
-        <w:rPr>
-          <w:rFonts w:ascii="DejaVu Sans" w:hAnsi="DejaVu Sans" w:cs="DejaVu Sans"/>
-        </w:rPr>
-        <w:t>{{cliente}}</w:t>
-      </w:r>
-    </w:p>
-    <w:p>
-      <w:pPr>
-        <w:spacing w:before="99"/>
-        <w:ind w:left="550"/>
-        <w:rPr>
-          <w:rFonts w:ascii="DejaVu Sans" w:hAnsi="DejaVu Sans" w:cs="DejaVu Sans"/>
-          <w:sz w:val="32"/>
-        </w:rPr>
-      </w:pPr>
-      <w:r>
-        <w:rPr>
-          <w:rFonts w:ascii="DejaVu Sans" w:hAnsi="DejaVu Sans" w:cs="DejaVu Sans"/>
-          <w:sz w:val="32"/>
-        </w:rPr>
-        <w:t>{{</w:t>
-      </w:r>
-      <w:proofErr w:type="spellStart"/>
-      <w:r>
-        <w:rPr>
-          <w:rFonts w:ascii="DejaVu Sans" w:hAnsi="DejaVu Sans" w:cs="DejaVu Sans"/>
-          <w:sz w:val="32"/>
-        </w:rPr>
-        <w:t>direccion</w:t>
-      </w:r>
-      <w:proofErr w:type="spellEnd"/>
-      <w:r>
-        <w:rPr>
-          <w:rFonts w:ascii="DejaVu Sans" w:hAnsi="DejaVu Sans" w:cs="DejaVu Sans"/>
-          <w:sz w:val="32"/>
-        </w:rPr>
-        <w:t>}}</w:t>
-      </w:r>
-    </w:p>
-    <w:p>
-      <w:pPr>
-        <w:spacing w:before="100"/>
-        <w:ind w:left="550"/>
-        <w:rPr>
-          <w:rFonts w:ascii="DejaVu Sans" w:hAnsi="DejaVu Sans" w:cs="DejaVu Sans"/>
-          <w:sz w:val="32"/>
-        </w:rPr>
-      </w:pPr>
-      <w:r>
-        <w:rPr>
-          <w:rFonts w:ascii="DejaVu Sans" w:hAnsi="DejaVu Sans" w:cs="DejaVu Sans"/>
-          <w:sz w:val="32"/>
-        </w:rPr>
-        <w:t>{{comuna}}</w:t>
-      </w:r>
-    </w:p>
-    <w:p>
-      <w:pPr>
-        <w:spacing w:before="100"/>
-        <w:ind w:left="550"/>
-        <w:rPr>
-          <w:rFonts w:ascii="DejaVu Sans" w:hAnsi="DejaVu Sans" w:cs="DejaVu Sans"/>
-          <w:sz w:val="32"/>
-        </w:rPr>
-      </w:pPr>
-      <w:r>
-        <w:rPr>
-          <w:rFonts w:ascii="DejaVu Sans" w:hAnsi="DejaVu Sans" w:cs="DejaVu Sans"/>
-          <w:sz w:val="32"/>
-        </w:rPr>
-        <w:t>{{contacto}}</w:t>
-      </w:r>
-    </w:p>
-    <w:p>
-      <w:pPr>
-        <w:spacing w:before="100"/>
-        <w:ind w:left="550"/>
-        <w:rPr>
-          <w:rFonts w:ascii="DejaVu Sans" w:hAnsi="DejaVu Sans" w:cs="DejaVu Sans"/>
-          <w:sz w:val="32"/>
-        </w:rPr>
-      </w:pPr>
-      <w:r>
-        <w:rPr>
-          <w:rFonts w:ascii="DejaVu Sans" w:hAnsi="DejaVu Sans" w:cs="DejaVu Sans"/>
-          <w:sz w:val="32"/>
-        </w:rPr>
-        <w:t>{{email}}</w:t>
-      </w:r>
-    </w:p>
-    <w:p>
-      <w:pPr>
-        <w:pStyle w:val="Textoindependiente"/>
-        <w:rPr>
-          <w:sz w:val="32"/>
-        </w:rPr>
-      </w:pPr>
-    </w:p>
-    <w:p>
-      <w:pPr>
-        <w:pStyle w:val="Textoindependiente"/>
-        <w:spacing w:before="66"/>
-        <w:rPr>
-          <w:sz w:val="32"/>
-        </w:rPr>
-      </w:pPr>
-    </w:p>
-    <w:p>
-      <w:pPr>
-        <w:pStyle w:val="Ttulo1"/>
-        <w:spacing w:before="1"/>
-        <w:rPr>
-          <w:rFonts w:ascii="DejaVu Sans" w:hAnsi="DejaVu Sans" w:cs="DejaVu Sans"/>
-        </w:rPr>
-      </w:pPr>
-      <w:r>
-        <w:rPr>
-          <w:rFonts w:ascii="DejaVu Sans" w:hAnsi="DejaVu Sans" w:cs="DejaVu Sans"/>
-          <w:color w:val="1F2A5B"/>
-          <w:spacing w:val="-4"/>
-        </w:rPr>
-        <w:t>DESCRIPCIÓN:</w:t>
-      </w:r>
-    </w:p>
-    <w:p>
-      <w:pPr>
-        <w:spacing w:before="89"/>
-        <w:ind w:left="400"/>
-        <w:rPr>
-          <w:rFonts w:ascii="DejaVu Sans" w:hAnsi="DejaVu Sans" w:cs="DejaVu Sans"/>
-          <w:b/>
-          <w:sz w:val="36"/>
-        </w:rPr>
-      </w:pPr>
-      <w:r>
-        <w:rPr>
-          <w:rFonts w:ascii="DejaVu Sans" w:hAnsi="DejaVu Sans" w:cs="DejaVu Sans"/>
-        </w:rPr>
-        <w:br w:type="column"/>
-      </w:r>
-      <w:r>
-        <w:rPr>
-          <w:rFonts w:ascii="DejaVu Sans" w:hAnsi="DejaVu Sans" w:cs="DejaVu Sans"/>
-          <w:b/>
-          <w:color w:val="1F2A5B"/>
-          <w:spacing w:val="-10"/>
-          <w:sz w:val="36"/>
-        </w:rPr>
-        <w:t>Datos</w:t>
-      </w:r>
-      <w:r>
-        <w:rPr>
-          <w:rFonts w:ascii="DejaVu Sans" w:hAnsi="DejaVu Sans" w:cs="DejaVu Sans"/>
-          <w:b/>
-          <w:color w:val="1F2A5B"/>
-          <w:spacing w:val="-34"/>
-          <w:sz w:val="36"/>
-        </w:rPr>
-        <w:t xml:space="preserve"> </w:t>
-      </w:r>
-      <w:r>
-        <w:rPr>
-          <w:rFonts w:ascii="DejaVu Sans" w:hAnsi="DejaVu Sans" w:cs="DejaVu Sans"/>
-          <w:b/>
-          <w:color w:val="1F2A5B"/>
-          <w:spacing w:val="-10"/>
-          <w:sz w:val="36"/>
-        </w:rPr>
-        <w:t>del</w:t>
-      </w:r>
-      <w:r>
-        <w:rPr>
-          <w:rFonts w:ascii="DejaVu Sans" w:hAnsi="DejaVu Sans" w:cs="DejaVu Sans"/>
-          <w:b/>
-          <w:color w:val="1F2A5B"/>
-          <w:spacing w:val="-34"/>
-          <w:sz w:val="36"/>
-        </w:rPr>
-        <w:t xml:space="preserve"> </w:t>
-      </w:r>
-      <w:r>
-        <w:rPr>
-          <w:rFonts w:ascii="DejaVu Sans" w:hAnsi="DejaVu Sans" w:cs="DejaVu Sans"/>
-          <w:b/>
-          <w:color w:val="1F2A5B"/>
-          <w:spacing w:val="-10"/>
-          <w:sz w:val="36"/>
-        </w:rPr>
-        <w:t>Emisor</w:t>
-      </w:r>
-    </w:p>
-    <w:p>
-      <w:pPr>
-        <w:pStyle w:val="Ttulo2"/>
-        <w:ind w:left="400"/>
-        <w:rPr>
-          <w:rFonts w:ascii="DejaVu Sans" w:hAnsi="DejaVu Sans" w:cs="DejaVu Sans"/>
-        </w:rPr>
-      </w:pPr>
-      <w:r>
-        <w:rPr>
-          <w:rFonts w:ascii="DejaVu Sans" w:hAnsi="DejaVu Sans" w:cs="DejaVu Sans"/>
-        </w:rPr>
-        <w:t>SMART</w:t>
-      </w:r>
-      <w:r>
-        <w:rPr>
-          <w:rFonts w:ascii="DejaVu Sans" w:hAnsi="DejaVu Sans" w:cs="DejaVu Sans"/>
-          <w:spacing w:val="33"/>
-        </w:rPr>
-        <w:t xml:space="preserve"> </w:t>
-      </w:r>
-      <w:r>
-        <w:rPr>
-          <w:rFonts w:ascii="DejaVu Sans" w:hAnsi="DejaVu Sans" w:cs="DejaVu Sans"/>
-        </w:rPr>
-        <w:t>PLAGAS</w:t>
-      </w:r>
-      <w:r>
-        <w:rPr>
-          <w:rFonts w:ascii="DejaVu Sans" w:hAnsi="DejaVu Sans" w:cs="DejaVu Sans"/>
-          <w:spacing w:val="34"/>
-        </w:rPr>
-        <w:t xml:space="preserve"> </w:t>
-      </w:r>
-      <w:r>
-        <w:rPr>
-          <w:rFonts w:ascii="DejaVu Sans" w:hAnsi="DejaVu Sans" w:cs="DejaVu Sans"/>
-          <w:spacing w:val="-2"/>
-        </w:rPr>
-        <w:t>E.I.R.L.</w:t>
-      </w:r>
-    </w:p>
-    <w:p>
-      <w:pPr>
-        <w:spacing w:before="99"/>
-        <w:ind w:left="400" w:right="-442"/>
-        <w:rPr>
-          <w:rFonts w:ascii="DejaVu Sans" w:hAnsi="DejaVu Sans" w:cs="DejaVu Sans"/>
-          <w:sz w:val="32"/>
-        </w:rPr>
-      </w:pPr>
-      <w:r>
-        <w:rPr>
-          <w:rFonts w:ascii="DejaVu Sans" w:hAnsi="DejaVu Sans" w:cs="DejaVu Sans"/>
-          <w:sz w:val="32"/>
-        </w:rPr>
-        <w:t>+56</w:t>
-      </w:r>
-      <w:r>
-        <w:rPr>
-          <w:rFonts w:ascii="DejaVu Sans" w:hAnsi="DejaVu Sans" w:cs="DejaVu Sans"/>
-          <w:spacing w:val="-25"/>
-          <w:sz w:val="32"/>
-        </w:rPr>
-        <w:t xml:space="preserve"> </w:t>
-      </w:r>
-      <w:r>
-        <w:rPr>
-          <w:rFonts w:ascii="DejaVu Sans" w:hAnsi="DejaVu Sans" w:cs="DejaVu Sans"/>
-          <w:sz w:val="32"/>
-        </w:rPr>
-        <w:t>9</w:t>
-      </w:r>
-      <w:r>
-        <w:rPr>
-          <w:rFonts w:ascii="DejaVu Sans" w:hAnsi="DejaVu Sans" w:cs="DejaVu Sans"/>
-          <w:spacing w:val="-25"/>
-          <w:sz w:val="32"/>
-        </w:rPr>
-        <w:t xml:space="preserve"> </w:t>
-      </w:r>
-      <w:r>
-        <w:rPr>
-          <w:rFonts w:ascii="DejaVu Sans" w:hAnsi="DejaVu Sans" w:cs="DejaVu Sans"/>
-          <w:sz w:val="32"/>
-        </w:rPr>
-        <w:t>5816</w:t>
-      </w:r>
-      <w:r>
-        <w:rPr>
-          <w:rFonts w:ascii="DejaVu Sans" w:hAnsi="DejaVu Sans" w:cs="DejaVu Sans"/>
-          <w:spacing w:val="-24"/>
-          <w:sz w:val="32"/>
-        </w:rPr>
-        <w:t xml:space="preserve"> </w:t>
-      </w:r>
-      <w:r>
-        <w:rPr>
-          <w:rFonts w:ascii="DejaVu Sans" w:hAnsi="DejaVu Sans" w:cs="DejaVu Sans"/>
-          <w:spacing w:val="-4"/>
-          <w:sz w:val="32"/>
-        </w:rPr>
-        <w:t>6055</w:t>
-      </w:r>
-    </w:p>
-    <w:p>
-      <w:pPr>
-        <w:spacing w:before="100" w:line="302" w:lineRule="auto"/>
-        <w:ind w:left="400" w:right="2110"/>
-        <w:rPr>
-          <w:rFonts w:ascii="DejaVu Sans" w:hAnsi="DejaVu Sans" w:cs="DejaVu Sans"/>
-          <w:sz w:val="32"/>
-        </w:rPr>
-      </w:pPr>
-      <w:hyperlink r:id="rId9" w:history="1">
-        <w:r>
-          <w:rPr>
-            <w:rStyle w:val="Hipervnculo"/>
-            <w:rFonts w:ascii="DejaVu Sans" w:hAnsi="DejaVu Sans" w:cs="DejaVu Sans"/>
-            <w:color w:val="000000" w:themeColor="text1"/>
-            <w:spacing w:val="-2"/>
-            <w:sz w:val="32"/>
-            <w:u w:val="none"/>
-          </w:rPr>
-          <w:t>contacto@smartplag.cl</w:t>
-        </w:r>
-      </w:hyperlink>
-      <w:r>
-        <w:rPr>
-          <w:rFonts w:ascii="DejaVu Sans" w:hAnsi="DejaVu Sans" w:cs="DejaVu Sans"/>
-          <w:spacing w:val="-2"/>
-          <w:sz w:val="32"/>
-        </w:rPr>
-        <w:t xml:space="preserve"> </w:t>
-      </w:r>
-      <w:hyperlink r:id="rId10">
-        <w:r>
-          <w:rPr>
-            <w:rFonts w:ascii="DejaVu Sans" w:hAnsi="DejaVu Sans" w:cs="DejaVu Sans"/>
-            <w:spacing w:val="-2"/>
-            <w:sz w:val="32"/>
-          </w:rPr>
-          <w:t>www.smartplagas.cl</w:t>
-        </w:r>
-      </w:hyperlink>
-    </w:p>
-    <w:p>
-      <w:pPr>
-        <w:spacing w:line="302" w:lineRule="auto"/>
-        <w:rPr>
-          <w:rFonts w:ascii="DejaVu Sans" w:hAnsi="DejaVu Sans" w:cs="DejaVu Sans"/>
-          <w:sz w:val="32"/>
-        </w:rPr>
-        <w:sectPr>
-          <w:type w:val="continuous"/>
-          <w:pgSz w:w="16850" w:h="23810"/>
-          <w:pgMar w:top="0" w:right="1275" w:bottom="0" w:left="1133" w:header="720" w:footer="720" w:gutter="0"/>
-          <w:cols w:num="2" w:space="720" w:equalWidth="0">
-            <w:col w:w="5108" w:space="2688"/>
-            <w:col w:w="6646"/>
-          </w:cols>
-        </w:sectPr>
-      </w:pPr>
-    </w:p>
-    <w:p>
-      <w:pPr>
-        <w:pStyle w:val="Textoindependiente"/>
-        <w:spacing w:before="75"/>
-        <w:ind w:left="426"/>
-        <w:rPr>
-          <w:rFonts w:ascii="DejaVu Sans" w:hAnsi="DejaVu Sans" w:cs="DejaVu Sans"/>
-          <w:sz w:val="32"/>
-          <w:szCs w:val="32"/>
-          <w:lang w:val="en-US"/>
-        </w:rPr>
-      </w:pPr>
-      <w:r>
-        <w:rPr>
-          <w:rFonts w:ascii="DejaVu Sans" w:hAnsi="DejaVu Sans" w:cs="DejaVu Sans"/>
-          <w:sz w:val="32"/>
-          <w:szCs w:val="32"/>
-          <w:lang w:val="en-US"/>
+      <w:r>
+        <w:rPr>
+          <w:rFonts w:ascii="DejaVu Sans" w:hAnsi="DejaVu Sans" w:cs="DejaVu Sans"/>
+          <w:noProof/>
+          <w:sz w:val="32"/>
         </w:rPr>
         <mc:AlternateContent>
           <mc:Choice Requires="wpg">
@@ -1431,13 +1422,11 @@
           </mc:Fallback>
         </mc:AlternateContent>
       </w:r>
-      <w:proofErr w:type="gramStart"/>
-      <w:r>
-        <w:rPr>
-          <w:rFonts w:ascii="DejaVu Sans" w:hAnsi="DejaVu Sans" w:cs="DejaVu Sans"/>
-          <w:sz w:val="32"/>
-          <w:szCs w:val="32"/>
-          <w:lang w:val="en-US"/>
+      <w:r>
+        <w:rPr>
+          <w:rFonts w:ascii="DejaVu Sans" w:hAnsi="DejaVu Sans" w:cs="DejaVu Sans"/>
+          <w:w w:val="105"/>
+          <w:sz w:val="32"/>
         </w:rPr>
         <w:t xml:space="preserve">{{ </w:t>
       </w:r>
@@ -1445,22 +1434,215 @@
       <w:r>
         <w:rPr>
           <w:rFonts w:ascii="DejaVu Sans" w:hAnsi="DejaVu Sans" w:cs="DejaVu Sans"/>
-          <w:sz w:val="32"/>
-          <w:szCs w:val="32"/>
-          <w:lang w:val="en-US"/>
+          <w:w w:val="105"/>
+          <w:sz w:val="32"/>
         </w:rPr>
         <w:t>descripcion</w:t>
       </w:r>
       <w:proofErr w:type="spellEnd"/>
-      <w:proofErr w:type="gramEnd"/>
-      <w:r>
-        <w:rPr>
-          <w:rFonts w:ascii="DejaVu Sans" w:hAnsi="DejaVu Sans" w:cs="DejaVu Sans"/>
-          <w:sz w:val="32"/>
-          <w:szCs w:val="32"/>
-          <w:lang w:val="en-US"/>
+      <w:r>
+        <w:rPr>
+          <w:rFonts w:ascii="DejaVu Sans" w:hAnsi="DejaVu Sans" w:cs="DejaVu Sans"/>
+          <w:w w:val="105"/>
+          <w:sz w:val="32"/>
         </w:rPr>
         <w:t xml:space="preserve"> }}</w:t>
+      </w:r>
+      <w:r>
+        <w:rPr>
+          <w:rFonts w:ascii="DejaVu Sans" w:hAnsi="DejaVu Sans" w:cs="DejaVu Sans"/>
+          <w:w w:val="105"/>
+          <w:sz w:val="32"/>
+        </w:rPr>
+        <w:t xml:space="preserve">, </w:t>
+      </w:r>
+      <w:r>
+        <w:rPr>
+          <w:rFonts w:ascii="DejaVu Sans" w:hAnsi="DejaVu Sans" w:cs="DejaVu Sans"/>
+          <w:w w:val="105"/>
+          <w:sz w:val="32"/>
+        </w:rPr>
+        <w:t>con instalación de estaciones</w:t>
+      </w:r>
+      <w:r>
+        <w:rPr>
+          <w:rFonts w:ascii="DejaVu Sans" w:hAnsi="DejaVu Sans" w:cs="DejaVu Sans"/>
+          <w:spacing w:val="40"/>
+          <w:w w:val="105"/>
+          <w:sz w:val="32"/>
+        </w:rPr>
+        <w:t xml:space="preserve"> </w:t>
+      </w:r>
+      <w:r>
+        <w:rPr>
+          <w:rFonts w:ascii="DejaVu Sans" w:hAnsi="DejaVu Sans" w:cs="DejaVu Sans"/>
+          <w:spacing w:val="-2"/>
+          <w:w w:val="105"/>
+          <w:sz w:val="32"/>
+        </w:rPr>
+        <w:t>cebaderas</w:t>
+      </w:r>
+      <w:r>
+        <w:rPr>
+          <w:rFonts w:ascii="DejaVu Sans" w:hAnsi="DejaVu Sans" w:cs="DejaVu Sans"/>
+          <w:spacing w:val="-29"/>
+          <w:w w:val="105"/>
+          <w:sz w:val="32"/>
+        </w:rPr>
+        <w:t xml:space="preserve"> </w:t>
+      </w:r>
+      <w:r>
+        <w:rPr>
+          <w:rFonts w:ascii="DejaVu Sans" w:hAnsi="DejaVu Sans" w:cs="DejaVu Sans"/>
+          <w:spacing w:val="-2"/>
+          <w:w w:val="105"/>
+          <w:sz w:val="32"/>
+        </w:rPr>
+        <w:t>y</w:t>
+      </w:r>
+      <w:r>
+        <w:rPr>
+          <w:rFonts w:ascii="DejaVu Sans" w:hAnsi="DejaVu Sans" w:cs="DejaVu Sans"/>
+          <w:spacing w:val="-29"/>
+          <w:w w:val="105"/>
+          <w:sz w:val="32"/>
+        </w:rPr>
+        <w:t xml:space="preserve"> </w:t>
+      </w:r>
+      <w:r>
+        <w:rPr>
+          <w:rFonts w:ascii="DejaVu Sans" w:hAnsi="DejaVu Sans" w:cs="DejaVu Sans"/>
+          <w:spacing w:val="-2"/>
+          <w:w w:val="105"/>
+          <w:sz w:val="32"/>
+        </w:rPr>
+        <w:t>entrega</w:t>
+      </w:r>
+      <w:r>
+        <w:rPr>
+          <w:rFonts w:ascii="DejaVu Sans" w:hAnsi="DejaVu Sans" w:cs="DejaVu Sans"/>
+          <w:spacing w:val="-29"/>
+          <w:w w:val="105"/>
+          <w:sz w:val="32"/>
+        </w:rPr>
+        <w:t xml:space="preserve"> </w:t>
+      </w:r>
+      <w:r>
+        <w:rPr>
+          <w:rFonts w:ascii="DejaVu Sans" w:hAnsi="DejaVu Sans" w:cs="DejaVu Sans"/>
+          <w:spacing w:val="-2"/>
+          <w:w w:val="105"/>
+          <w:sz w:val="32"/>
+        </w:rPr>
+        <w:t>de</w:t>
+      </w:r>
+      <w:r>
+        <w:rPr>
+          <w:rFonts w:ascii="DejaVu Sans" w:hAnsi="DejaVu Sans" w:cs="DejaVu Sans"/>
+          <w:spacing w:val="-29"/>
+          <w:w w:val="105"/>
+          <w:sz w:val="32"/>
+        </w:rPr>
+        <w:t xml:space="preserve"> </w:t>
+      </w:r>
+      <w:r>
+        <w:rPr>
+          <w:rFonts w:ascii="DejaVu Sans" w:hAnsi="DejaVu Sans" w:cs="DejaVu Sans"/>
+          <w:spacing w:val="-2"/>
+          <w:w w:val="105"/>
+          <w:sz w:val="32"/>
+        </w:rPr>
+        <w:t>informe</w:t>
+      </w:r>
+      <w:r>
+        <w:rPr>
+          <w:rFonts w:ascii="DejaVu Sans" w:hAnsi="DejaVu Sans" w:cs="DejaVu Sans"/>
+          <w:spacing w:val="-29"/>
+          <w:w w:val="105"/>
+          <w:sz w:val="32"/>
+        </w:rPr>
+        <w:t xml:space="preserve"> </w:t>
+      </w:r>
+      <w:r>
+        <w:rPr>
+          <w:rFonts w:ascii="DejaVu Sans" w:hAnsi="DejaVu Sans" w:cs="DejaVu Sans"/>
+          <w:spacing w:val="-2"/>
+          <w:w w:val="105"/>
+          <w:sz w:val="32"/>
+        </w:rPr>
+        <w:t>sanitario</w:t>
+      </w:r>
+      <w:r>
+        <w:rPr>
+          <w:rFonts w:ascii="DejaVu Sans" w:hAnsi="DejaVu Sans" w:cs="DejaVu Sans"/>
+          <w:spacing w:val="-29"/>
+          <w:w w:val="105"/>
+          <w:sz w:val="32"/>
+        </w:rPr>
+        <w:t xml:space="preserve"> </w:t>
+      </w:r>
+      <w:r>
+        <w:rPr>
+          <w:rFonts w:ascii="DejaVu Sans" w:hAnsi="DejaVu Sans" w:cs="DejaVu Sans"/>
+          <w:spacing w:val="-2"/>
+          <w:w w:val="105"/>
+          <w:sz w:val="32"/>
+        </w:rPr>
+        <w:t>conforme</w:t>
+      </w:r>
+      <w:r>
+        <w:rPr>
+          <w:rFonts w:ascii="DejaVu Sans" w:hAnsi="DejaVu Sans" w:cs="DejaVu Sans"/>
+          <w:spacing w:val="-29"/>
+          <w:w w:val="105"/>
+          <w:sz w:val="32"/>
+        </w:rPr>
+        <w:t xml:space="preserve"> </w:t>
+      </w:r>
+      <w:r>
+        <w:rPr>
+          <w:rFonts w:ascii="DejaVu Sans" w:hAnsi="DejaVu Sans" w:cs="DejaVu Sans"/>
+          <w:spacing w:val="-2"/>
+          <w:w w:val="105"/>
+          <w:sz w:val="32"/>
+        </w:rPr>
+        <w:t>a</w:t>
+      </w:r>
+      <w:r>
+        <w:rPr>
+          <w:rFonts w:ascii="DejaVu Sans" w:hAnsi="DejaVu Sans" w:cs="DejaVu Sans"/>
+          <w:spacing w:val="-29"/>
+          <w:w w:val="105"/>
+          <w:sz w:val="32"/>
+        </w:rPr>
+        <w:t xml:space="preserve"> </w:t>
+      </w:r>
+      <w:r>
+        <w:rPr>
+          <w:rFonts w:ascii="DejaVu Sans" w:hAnsi="DejaVu Sans" w:cs="DejaVu Sans"/>
+          <w:spacing w:val="-2"/>
+          <w:w w:val="105"/>
+          <w:sz w:val="32"/>
+        </w:rPr>
+        <w:t>exigencias</w:t>
+      </w:r>
+      <w:r>
+        <w:rPr>
+          <w:rFonts w:ascii="DejaVu Sans" w:hAnsi="DejaVu Sans" w:cs="DejaVu Sans"/>
+          <w:spacing w:val="-29"/>
+          <w:w w:val="105"/>
+          <w:sz w:val="32"/>
+        </w:rPr>
+        <w:t xml:space="preserve"> </w:t>
+      </w:r>
+      <w:r>
+        <w:rPr>
+          <w:rFonts w:ascii="DejaVu Sans" w:hAnsi="DejaVu Sans" w:cs="DejaVu Sans"/>
+          <w:spacing w:val="-2"/>
+          <w:w w:val="105"/>
+          <w:sz w:val="32"/>
+        </w:rPr>
+        <w:t>SEREMI.</w:t>
       </w:r>
     </w:p>
     <w:p>
@@ -1484,7 +1666,7 @@
     <w:tbl>
       <w:tblPr>
         <w:tblStyle w:val="Tablaconcuadrcula"/>
-        <w:tblW w:w="0" w:type="auto"/>
+        <w:tblW w:w="13768" w:type="dxa"/>
         <w:tblInd w:w="534" w:type="dxa"/>
         <w:tblBorders>
           <w:top w:val="single" w:sz="12" w:space="0" w:color="365F91" w:themeColor="accent1" w:themeShade="BF"/>
@@ -1497,14 +1679,14 @@
         <w:tblLook w:val="04A0" w:firstRow="1" w:lastRow="0" w:firstColumn="1" w:lastColumn="0" w:noHBand="0" w:noVBand="1"/>
       </w:tblPr>
       <w:tblGrid>
-        <w:gridCol w:w="5972"/>
-        <w:gridCol w:w="3685"/>
-        <w:gridCol w:w="3809"/>
+        <w:gridCol w:w="6539"/>
+        <w:gridCol w:w="1843"/>
+        <w:gridCol w:w="5386"/>
       </w:tblGrid>
       <w:tr>
         <w:tc>
           <w:tcPr>
-            <w:tcW w:w="5972" w:type="dxa"/>
+            <w:tcW w:w="6539" w:type="dxa"/>
             <w:shd w:val="clear" w:color="auto" w:fill="548DD4" w:themeFill="text2" w:themeFillTint="99"/>
             <w:vAlign w:val="center"/>
           </w:tcPr>
@@ -1537,7 +1719,7 @@
         </w:tc>
         <w:tc>
           <w:tcPr>
-            <w:tcW w:w="3685" w:type="dxa"/>
+            <w:tcW w:w="1843" w:type="dxa"/>
             <w:shd w:val="clear" w:color="auto" w:fill="548DD4" w:themeFill="text2" w:themeFillTint="99"/>
             <w:vAlign w:val="center"/>
           </w:tcPr>
@@ -1564,13 +1746,13 @@
                 <w:sz w:val="28"/>
                 <w:szCs w:val="36"/>
               </w:rPr>
-              <w:t>CANTIDAD</w:t>
+              <w:t>M2</w:t>
             </w:r>
           </w:p>
         </w:tc>
         <w:tc>
           <w:tcPr>
-            <w:tcW w:w="3809" w:type="dxa"/>
+            <w:tcW w:w="5386" w:type="dxa"/>
             <w:shd w:val="clear" w:color="auto" w:fill="548DD4" w:themeFill="text2" w:themeFillTint="99"/>
             <w:vAlign w:val="center"/>
           </w:tcPr>
@@ -1635,7 +1817,7 @@
       <w:tr>
         <w:tc>
           <w:tcPr>
-            <w:tcW w:w="5972" w:type="dxa"/>
+            <w:tcW w:w="6539" w:type="dxa"/>
             <w:vAlign w:val="center"/>
           </w:tcPr>
           <w:p>
@@ -1679,7 +1861,7 @@
         </w:tc>
         <w:tc>
           <w:tcPr>
-            <w:tcW w:w="3685" w:type="dxa"/>
+            <w:tcW w:w="1843" w:type="dxa"/>
             <w:vAlign w:val="center"/>
           </w:tcPr>
           <w:p>
@@ -1699,31 +1881,13 @@
                 <w:sz w:val="32"/>
                 <w:szCs w:val="32"/>
               </w:rPr>
-              <w:t xml:space="preserve">{{ </w:t>
-            </w:r>
-            <w:proofErr w:type="spellStart"/>
-            <w:r>
-              <w:rPr>
-                <w:rFonts w:ascii="DejaVu Sans" w:hAnsi="DejaVu Sans" w:cs="DejaVu Sans"/>
-                <w:sz w:val="32"/>
-                <w:szCs w:val="32"/>
-              </w:rPr>
-              <w:t>linea_cantidad</w:t>
-            </w:r>
-            <w:proofErr w:type="spellEnd"/>
-            <w:r>
-              <w:rPr>
-                <w:rFonts w:ascii="DejaVu Sans" w:hAnsi="DejaVu Sans" w:cs="DejaVu Sans"/>
-                <w:sz w:val="32"/>
-                <w:szCs w:val="32"/>
-              </w:rPr>
-              <w:t xml:space="preserve"> }}</w:t>
+              <w:t>{{ m2 }}</w:t>
             </w:r>
           </w:p>
         </w:tc>
         <w:tc>
           <w:tcPr>
-            <w:tcW w:w="3809" w:type="dxa"/>
+            <w:tcW w:w="5386" w:type="dxa"/>
             <w:vAlign w:val="center"/>
           </w:tcPr>
           <w:p>
@@ -1846,7 +2010,6 @@
             <w:pPr>
               <w:pStyle w:val="TableParagraph"/>
               <w:spacing w:before="112" w:line="521" w:lineRule="exact"/>
-              <w:jc w:val="center"/>
               <w:rPr>
                 <w:rFonts w:ascii="DejaVu Sans" w:hAnsi="DejaVu Sans" w:cs="DejaVu Sans"/>
                 <w:b/>
@@ -1881,9 +2044,13 @@
         <w:pStyle w:val="Ttulo1"/>
         <w:spacing w:before="34"/>
         <w:ind w:left="109"/>
-      </w:pPr>
-      <w:r>
-        <w:rPr>
+        <w:rPr>
+          <w:rFonts w:ascii="DejaVu Sans" w:hAnsi="DejaVu Sans" w:cs="DejaVu Sans"/>
+        </w:rPr>
+      </w:pPr>
+      <w:r>
+        <w:rPr>
+          <w:rFonts w:ascii="DejaVu Sans" w:hAnsi="DejaVu Sans" w:cs="DejaVu Sans"/>
           <w:color w:val="1F2A5B"/>
           <w:spacing w:val="-2"/>
         </w:rPr>
@@ -2834,9 +3001,7 @@
         <w:spacing w:before="86"/>
         <w:jc w:val="both"/>
         <w:rPr>
-          <w:rFonts w:ascii="DejaVu Sans" w:hAnsi="DejaVu Sans" w:cs="DejaVu Sans"/>
-          <w:i/>
-          <w:iCs/>
+          <w:sz w:val="34"/>
         </w:rPr>
       </w:pPr>
       <w:r>
@@ -4085,6 +4250,7 @@
   <w:style w:type="character" w:default="1" w:styleId="Fuentedeprrafopredeter">
     <w:name w:val="Default Paragraph Font"/>
     <w:uiPriority w:val="1"/>
+    <w:semiHidden/>
     <w:unhideWhenUsed/>
   </w:style>
   <w:style w:type="table" w:default="1" w:styleId="Tablanormal">
@@ -4183,35 +4349,12 @@
     <w:basedOn w:val="Fuentedeprrafopredeter"/>
     <w:link w:val="Textoindependiente"/>
     <w:uiPriority w:val="1"/>
-    <w:rsid w:val="0061544B"/>
+    <w:rsid w:val="00792262"/>
     <w:rPr>
       <w:rFonts w:ascii="Tahoma" w:eastAsia="Tahoma" w:hAnsi="Tahoma" w:cs="Tahoma"/>
       <w:sz w:val="26"/>
       <w:szCs w:val="26"/>
       <w:lang w:val="es-ES"/>
-    </w:rPr>
-  </w:style>
-  <w:style w:type="character" w:styleId="Hipervnculo">
-    <w:name w:val="Hyperlink"/>
-    <w:basedOn w:val="Fuentedeprrafopredeter"/>
-    <w:uiPriority w:val="99"/>
-    <w:unhideWhenUsed/>
-    <w:rsid w:val="00B0302D"/>
-    <w:rPr>
-      <w:color w:val="0000FF" w:themeColor="hyperlink"/>
-      <w:u w:val="single"/>
-    </w:rPr>
-  </w:style>
-  <w:style w:type="character" w:styleId="Mencinsinresolver">
-    <w:name w:val="Unresolved Mention"/>
-    <w:basedOn w:val="Fuentedeprrafopredeter"/>
-    <w:uiPriority w:val="99"/>
-    <w:semiHidden/>
-    <w:unhideWhenUsed/>
-    <w:rsid w:val="00B0302D"/>
-    <w:rPr>
-      <w:color w:val="605E5C"/>
-      <w:shd w:val="clear" w:color="auto" w:fill="E1DFDD"/>
     </w:rPr>
   </w:style>
 </w:styles>

</xml_diff>